<commit_message>
Update Week 4 survival analysis: generate KM curves for all 13 prognostic genes across 4 panels
</commit_message>
<xml_diff>
--- a/Week4/project_description_week4.docx
+++ b/Week4/project_description_week4.docx
@@ -2354,7 +2354,15 @@
           <w:color w:val="5A5A5A"/>
           <w:sz w:val="24"/>
         </w:rPr>
-        <w:t>3. 代表性 KM 生存曲线面板</w:t>
+        <w:t>3. 13 个高危基因 KM 生存曲线面板（共 4 张图）</w:t>
+      </w:r>
+    </w:p>
+    <w:p>
+      <w:pPr>
+        <w:spacing w:after="120" w:line="276" w:lineRule="auto"/>
+      </w:pPr>
+      <w:r>
+        <w:t>为了避免图表过于臃肿，我们将筛选出的 13 个显著高危预后基因分成了 4 张经典的 $2 \times 2$ 面板图展示：</w:t>
       </w:r>
     </w:p>
     <w:p>
@@ -2368,25 +2376,10 @@
         <w:rPr>
           <w:b/>
         </w:rPr>
-        <w:t>`km_curves_top_genes.png`</w:t>
-      </w:r>
-      <w:r/>
-    </w:p>
-    <w:p>
-      <w:pPr>
-        <w:pStyle w:val="ListBullet"/>
-        <w:spacing w:after="60"/>
-        <w:ind w:left="720"/>
-      </w:pPr>
-      <w:r/>
-      <w:r>
-        <w:rPr>
-          <w:b/>
-        </w:rPr>
-        <w:t>定义</w:t>
+        <w:t>`km_curves_panel1.png`</w:t>
       </w:r>
       <w:r>
-        <w:t>：$2 \times 2$ 排列的 Kaplan-Meier 整体生存率曲线图，包含最显著的前 3 个危险基因（</w:t>
+        <w:t xml:space="preserve"> (Panel 1)：展示统计学显著性最强的前 4 名基因：</w:t>
       </w:r>
       <w:r>
         <w:rPr>
@@ -2397,7 +2390,7 @@
         <w:t>IL1R2</w:t>
       </w:r>
       <w:r>
-        <w:t xml:space="preserve">, </w:t>
+        <w:t>、</w:t>
       </w:r>
       <w:r>
         <w:rPr>
@@ -2408,7 +2401,7 @@
         <w:t>SLC15A3</w:t>
       </w:r>
       <w:r>
-        <w:t xml:space="preserve">, </w:t>
+        <w:t>、</w:t>
       </w:r>
       <w:r>
         <w:rPr>
@@ -2419,7 +2412,85 @@
         <w:t>NKX2-3</w:t>
       </w:r>
       <w:r>
-        <w:t xml:space="preserve">）以及关键临床治疗靶点 </w:t>
+        <w:t>、</w:t>
+      </w:r>
+      <w:r>
+        <w:rPr>
+          <w:rFonts w:ascii="Courier New" w:hAnsi="Courier New"/>
+          <w:color w:val="505050"/>
+          <w:sz w:val="19"/>
+        </w:rPr>
+        <w:t>NCF1C</w:t>
+      </w:r>
+      <w:r>
+        <w:t>。</w:t>
+      </w:r>
+    </w:p>
+    <w:p>
+      <w:pPr>
+        <w:pStyle w:val="ListBullet"/>
+        <w:spacing w:after="60"/>
+        <w:ind w:left="360"/>
+      </w:pPr>
+      <w:r/>
+      <w:r>
+        <w:rPr>
+          <w:b/>
+        </w:rPr>
+        <w:t>`km_curves_panel2.png`</w:t>
+      </w:r>
+      <w:r>
+        <w:t xml:space="preserve"> (Panel 2)：展示第 5 至 7 名基因：</w:t>
+      </w:r>
+      <w:r>
+        <w:rPr>
+          <w:rFonts w:ascii="Courier New" w:hAnsi="Courier New"/>
+          <w:color w:val="505050"/>
+          <w:sz w:val="19"/>
+        </w:rPr>
+        <w:t>NCF1</w:t>
+      </w:r>
+      <w:r>
+        <w:t>、</w:t>
+      </w:r>
+      <w:r>
+        <w:rPr>
+          <w:rFonts w:ascii="Courier New" w:hAnsi="Courier New"/>
+          <w:color w:val="505050"/>
+          <w:sz w:val="19"/>
+        </w:rPr>
+        <w:t>VNN2</w:t>
+      </w:r>
+      <w:r>
+        <w:t>、</w:t>
+      </w:r>
+      <w:r>
+        <w:rPr>
+          <w:rFonts w:ascii="Courier New" w:hAnsi="Courier New"/>
+          <w:color w:val="505050"/>
+          <w:sz w:val="19"/>
+        </w:rPr>
+        <w:t>CXCR1</w:t>
+      </w:r>
+      <w:r>
+        <w:t>。</w:t>
+      </w:r>
+    </w:p>
+    <w:p>
+      <w:pPr>
+        <w:pStyle w:val="ListBullet"/>
+        <w:spacing w:after="60"/>
+        <w:ind w:left="360"/>
+      </w:pPr>
+      <w:r/>
+      <w:r>
+        <w:rPr>
+          <w:b/>
+        </w:rPr>
+        <w:t>`km_curves_panel3.png`</w:t>
+      </w:r>
+      <w:r>
+        <w:t xml:space="preserve"> (Panel 3)：展示第 8 至 10 名基因（含关键靶点 </w:t>
       </w:r>
       <w:r>
         <w:rPr>
@@ -2430,24 +2501,98 @@
         <w:t>IL3RA</w:t>
       </w:r>
       <w:r>
-        <w:t>/CD123。</w:t>
+        <w:t>/CD123）：</w:t>
+      </w:r>
+      <w:r>
+        <w:rPr>
+          <w:rFonts w:ascii="Courier New" w:hAnsi="Courier New"/>
+          <w:color w:val="505050"/>
+          <w:sz w:val="19"/>
+        </w:rPr>
+        <w:t>IL3RA</w:t>
+      </w:r>
+      <w:r>
+        <w:t>、</w:t>
+      </w:r>
+      <w:r>
+        <w:rPr>
+          <w:rFonts w:ascii="Courier New" w:hAnsi="Courier New"/>
+          <w:color w:val="505050"/>
+          <w:sz w:val="19"/>
+        </w:rPr>
+        <w:t>CXCR2</w:t>
+      </w:r>
+      <w:r>
+        <w:t>、</w:t>
+      </w:r>
+      <w:r>
+        <w:rPr>
+          <w:rFonts w:ascii="Courier New" w:hAnsi="Courier New"/>
+          <w:color w:val="505050"/>
+          <w:sz w:val="19"/>
+        </w:rPr>
+        <w:t>CD14</w:t>
+      </w:r>
+      <w:r>
+        <w:t>。</w:t>
       </w:r>
     </w:p>
     <w:p>
       <w:pPr>
         <w:pStyle w:val="ListBullet"/>
         <w:spacing w:after="60"/>
-        <w:ind w:left="720"/>
+        <w:ind w:left="360"/>
       </w:pPr>
       <w:r/>
       <w:r>
         <w:rPr>
           <w:b/>
         </w:rPr>
-        <w:t>解释</w:t>
+        <w:t>`km_curves_panel4.png`</w:t>
       </w:r>
       <w:r>
-        <w:t>：图中蓝色曲线代表低表达组，红色曲线代表高表达组。每个图表均附带 Log-rank 检验 of P 值和患者风险人数表（Risk Table）。高表达组（红线）的存活率衰减速度显著快于低表达组（蓝线），中位生存天数大幅缩短。</w:t>
+        <w:t xml:space="preserve"> (Panel 4)：展示第 11 至 13 名基因：</w:t>
+      </w:r>
+      <w:r>
+        <w:rPr>
+          <w:rFonts w:ascii="Courier New" w:hAnsi="Courier New"/>
+          <w:color w:val="505050"/>
+          <w:sz w:val="19"/>
+        </w:rPr>
+        <w:t>CMTM2</w:t>
+      </w:r>
+      <w:r>
+        <w:t>、</w:t>
+      </w:r>
+      <w:r>
+        <w:rPr>
+          <w:rFonts w:ascii="Courier New" w:hAnsi="Courier New"/>
+          <w:color w:val="505050"/>
+          <w:sz w:val="19"/>
+        </w:rPr>
+        <w:t>GZMB</w:t>
+      </w:r>
+      <w:r>
+        <w:t>、</w:t>
+      </w:r>
+      <w:r>
+        <w:rPr>
+          <w:rFonts w:ascii="Courier New" w:hAnsi="Courier New"/>
+          <w:color w:val="505050"/>
+          <w:sz w:val="19"/>
+        </w:rPr>
+        <w:t>FPR2</w:t>
+      </w:r>
+      <w:r>
+        <w:t>。</w:t>
+      </w:r>
+    </w:p>
+    <w:p>
+      <w:pPr>
+        <w:spacing w:after="120" w:line="276" w:lineRule="auto"/>
+      </w:pPr>
+      <w:r>
+        <w:t>在每张图中，蓝色曲线代表对应基因的低表达组，红色曲线代表高表达组。图表中附带 Log-rank 检验的 P 值及患者风险人数表（Risk Table）。所有 13 个高危基因的生存曲线均表明高表达组（红线）的存活率衰减速度显著快于低表达组（蓝线），证明其临床高危特征。</w:t>
       </w:r>
     </w:p>
     <w:p>
@@ -2467,7 +2612,7 @@
               <a:graphicData uri="http://schemas.openxmlformats.org/drawingml/2006/picture">
                 <pic:pic>
                   <pic:nvPicPr>
-                    <pic:cNvPr id="0" name="km_curves_top_genes.png"/>
+                    <pic:cNvPr id="0" name="km_curves_panel1.png"/>
                     <pic:cNvPicPr/>
                   </pic:nvPicPr>
                   <pic:blipFill>
@@ -2502,7 +2647,172 @@
           <w:color w:val="646464"/>
           <w:sz w:val="19"/>
         </w:rPr>
-        <w:t>图：Kaplan-Meier Survival Curves</w:t>
+        <w:t>图：KM Survival Curves Panel 1</w:t>
+      </w:r>
+    </w:p>
+    <w:p>
+      <w:pPr>
+        <w:spacing w:before="120" w:after="120"/>
+        <w:jc w:val="center"/>
+      </w:pPr>
+      <w:r>
+        <w:drawing>
+          <wp:inline xmlns:a="http://schemas.openxmlformats.org/drawingml/2006/main" xmlns:pic="http://schemas.openxmlformats.org/drawingml/2006/picture">
+            <wp:extent cx="5029200" cy="4114800"/>
+            <wp:docPr id="3" name="Picture 3"/>
+            <wp:cNvGraphicFramePr>
+              <a:graphicFrameLocks noChangeAspect="1"/>
+            </wp:cNvGraphicFramePr>
+            <a:graphic>
+              <a:graphicData uri="http://schemas.openxmlformats.org/drawingml/2006/picture">
+                <pic:pic>
+                  <pic:nvPicPr>
+                    <pic:cNvPr id="0" name="km_curves_panel2.png"/>
+                    <pic:cNvPicPr/>
+                  </pic:nvPicPr>
+                  <pic:blipFill>
+                    <a:blip r:embed="rId11"/>
+                    <a:stretch>
+                      <a:fillRect/>
+                    </a:stretch>
+                  </pic:blipFill>
+                  <pic:spPr>
+                    <a:xfrm>
+                      <a:off x="0" y="0"/>
+                      <a:ext cx="5029200" cy="4114800"/>
+                    </a:xfrm>
+                    <a:prstGeom prst="rect"/>
+                  </pic:spPr>
+                </pic:pic>
+              </a:graphicData>
+            </a:graphic>
+          </wp:inline>
+        </w:drawing>
+      </w:r>
+    </w:p>
+    <w:p>
+      <w:pPr>
+        <w:spacing w:before="80" w:after="240"/>
+        <w:jc w:val="center"/>
+      </w:pPr>
+      <w:r>
+        <w:rPr>
+          <w:rFonts w:ascii="Arial" w:hAnsi="Arial"/>
+          <w:i/>
+          <w:color w:val="646464"/>
+          <w:sz w:val="19"/>
+        </w:rPr>
+        <w:t>图：KM Survival Curves Panel 2</w:t>
+      </w:r>
+    </w:p>
+    <w:p>
+      <w:pPr>
+        <w:spacing w:before="120" w:after="120"/>
+        <w:jc w:val="center"/>
+      </w:pPr>
+      <w:r>
+        <w:drawing>
+          <wp:inline xmlns:a="http://schemas.openxmlformats.org/drawingml/2006/main" xmlns:pic="http://schemas.openxmlformats.org/drawingml/2006/picture">
+            <wp:extent cx="5029200" cy="4114800"/>
+            <wp:docPr id="4" name="Picture 4"/>
+            <wp:cNvGraphicFramePr>
+              <a:graphicFrameLocks noChangeAspect="1"/>
+            </wp:cNvGraphicFramePr>
+            <a:graphic>
+              <a:graphicData uri="http://schemas.openxmlformats.org/drawingml/2006/picture">
+                <pic:pic>
+                  <pic:nvPicPr>
+                    <pic:cNvPr id="0" name="km_curves_panel3.png"/>
+                    <pic:cNvPicPr/>
+                  </pic:nvPicPr>
+                  <pic:blipFill>
+                    <a:blip r:embed="rId12"/>
+                    <a:stretch>
+                      <a:fillRect/>
+                    </a:stretch>
+                  </pic:blipFill>
+                  <pic:spPr>
+                    <a:xfrm>
+                      <a:off x="0" y="0"/>
+                      <a:ext cx="5029200" cy="4114800"/>
+                    </a:xfrm>
+                    <a:prstGeom prst="rect"/>
+                  </pic:spPr>
+                </pic:pic>
+              </a:graphicData>
+            </a:graphic>
+          </wp:inline>
+        </w:drawing>
+      </w:r>
+    </w:p>
+    <w:p>
+      <w:pPr>
+        <w:spacing w:before="80" w:after="240"/>
+        <w:jc w:val="center"/>
+      </w:pPr>
+      <w:r>
+        <w:rPr>
+          <w:rFonts w:ascii="Arial" w:hAnsi="Arial"/>
+          <w:i/>
+          <w:color w:val="646464"/>
+          <w:sz w:val="19"/>
+        </w:rPr>
+        <w:t>图：KM Survival Curves Panel 3</w:t>
+      </w:r>
+    </w:p>
+    <w:p>
+      <w:pPr>
+        <w:spacing w:before="120" w:after="120"/>
+        <w:jc w:val="center"/>
+      </w:pPr>
+      <w:r>
+        <w:drawing>
+          <wp:inline xmlns:a="http://schemas.openxmlformats.org/drawingml/2006/main" xmlns:pic="http://schemas.openxmlformats.org/drawingml/2006/picture">
+            <wp:extent cx="5029200" cy="4114800"/>
+            <wp:docPr id="5" name="Picture 5"/>
+            <wp:cNvGraphicFramePr>
+              <a:graphicFrameLocks noChangeAspect="1"/>
+            </wp:cNvGraphicFramePr>
+            <a:graphic>
+              <a:graphicData uri="http://schemas.openxmlformats.org/drawingml/2006/picture">
+                <pic:pic>
+                  <pic:nvPicPr>
+                    <pic:cNvPr id="0" name="km_curves_panel4.png"/>
+                    <pic:cNvPicPr/>
+                  </pic:nvPicPr>
+                  <pic:blipFill>
+                    <a:blip r:embed="rId13"/>
+                    <a:stretch>
+                      <a:fillRect/>
+                    </a:stretch>
+                  </pic:blipFill>
+                  <pic:spPr>
+                    <a:xfrm>
+                      <a:off x="0" y="0"/>
+                      <a:ext cx="5029200" cy="4114800"/>
+                    </a:xfrm>
+                    <a:prstGeom prst="rect"/>
+                  </pic:spPr>
+                </pic:pic>
+              </a:graphicData>
+            </a:graphic>
+          </wp:inline>
+        </w:drawing>
+      </w:r>
+    </w:p>
+    <w:p>
+      <w:pPr>
+        <w:spacing w:before="80" w:after="240"/>
+        <w:jc w:val="center"/>
+      </w:pPr>
+      <w:r>
+        <w:rPr>
+          <w:rFonts w:ascii="Arial" w:hAnsi="Arial"/>
+          <w:i/>
+          <w:color w:val="646464"/>
+          <w:sz w:val="19"/>
+        </w:rPr>
+        <w:t>图：KM Survival Curves Panel 4</w:t>
       </w:r>
     </w:p>
     <w:p>

</xml_diff>